<commit_message>
Rebrand website as general RDQA consultancy, remove Tiko-specific references
- Repositioned as "Mubiri & Wayesu — Independent RDQA Consultants" serving
  multiple health programmes, NGOs, and government partners in Uganda
- Replaced all Tiko Africa-specific content with client-agnostic messaging
- Anonymised demo data: facilities now "Facility A1-A6, B1-B6" across
  generic "District A (Urban)" and "District B (Peri-Urban)"
- Added new "Services" section (RDQAs, Digital Cross-Checks, Data Reviews)
- Added "Programmes We Have Supported" section showcasing 5 real past
  engagements (PTBi, MGIC/PEPFAR, iTECH, Sanyu Africa, UVRI)
- Added "Your Programme Here" card inviting new clients
- Updated hero badge to "Now accepting Q2 2026 engagements across Uganda"
- Updated CTA with pre-filled email template for enquiries
- Updated nav brand to "MW" (Mubiri & Wayesu)
- Updated ARCHITECTURE.md and .docx to reflect new positioning

https://claude.ai/code/session_015BtjMoQbpeJ26zz4ypTTxf
</commit_message>
<xml_diff>
--- a/rdqa_web_demo/ARCHITECTURE.docx
+++ b/rdqa_web_demo/ARCHITECTURE.docx
@@ -11,13 +11,13 @@
         <w:t xml:space="preserve">RDQA Demo Website Architecture</w:t>
       </w:r>
     </w:p>
-    <w:bookmarkStart w:id="9" w:name="X0729b720b51cdb371ba2b8272a2ec695471c4d4"/>
+    <w:bookmarkStart w:id="9" w:name="mubiri-wayesu-rdqa-consultancy-website"/>
     <w:p>
       <w:pPr>
         <w:pStyle w:val="Heading2"/>
       </w:pPr>
       <w:r>
-        <w:t xml:space="preserve">Tiko RDQA Consultancy — Demo-Sell-Build Website</w:t>
+        <w:t xml:space="preserve">Mubiri &amp; Wayesu — RDQA Consultancy Website</w:t>
       </w:r>
     </w:p>
     <w:p>
@@ -35,7 +35,7 @@
         <w:t xml:space="preserve"> </w:t>
       </w:r>
       <w:r>
-        <w:t xml:space="preserve">Routine Data Quality Audits (RDQAs) for Tiko Africa — Uganda Programme</w:t>
+        <w:t xml:space="preserve">Independent Routine Data Quality Audit (RDQA) Services for Health Programmes in Uganda</w:t>
       </w:r>
       <w:r>
         <w:t xml:space="preserve"> </w:t>
@@ -83,7 +83,7 @@
         <w:t xml:space="preserve"> </w:t>
       </w:r>
       <w:r>
-        <w:t xml:space="preserve">Professional demo website to showcase the RDQA consultancy capabilities, methodology, and simulated deliverables to prospective clients — following the</w:t>
+        <w:t xml:space="preserve">Professional consultancy website to position Mubiri &amp; Wayesu as established, independent RDQA consultants serving multiple health programmes, NGOs, and government partners in Uganda. Follows the</w:t>
       </w:r>
       <w:r>
         <w:t xml:space="preserve"> </w:t>
@@ -95,7 +95,7 @@
         <w:t xml:space="preserve"> </w:t>
       </w:r>
       <w:r>
-        <w:t xml:space="preserve">approach.</w:t>
+        <w:t xml:space="preserve">approach with anonymised, client-agnostic simulated data.</w:t>
       </w:r>
     </w:p>
     <w:p>
@@ -120,23 +120,23 @@
         <w:pStyle w:val="FirstParagraph"/>
       </w:pPr>
       <w:r>
-        <w:t xml:space="preserve">This website is a</w:t>
-      </w:r>
-      <w:r>
-        <w:t xml:space="preserve"> </w:t>
-      </w:r>
-      <w:r>
-        <w:rPr>
-          <w:b/>
-          <w:bCs/>
-        </w:rPr>
-        <w:t xml:space="preserve">demo</w:t>
-      </w:r>
-      <w:r>
-        <w:t xml:space="preserve"> </w:t>
-      </w:r>
-      <w:r>
-        <w:t xml:space="preserve">— not the final product. It is designed to:</w:t>
+        <w:t xml:space="preserve">This website positions the consultancy as a</w:t>
+      </w:r>
+      <w:r>
+        <w:t xml:space="preserve"> </w:t>
+      </w:r>
+      <w:r>
+        <w:rPr>
+          <w:b/>
+          <w:bCs/>
+        </w:rPr>
+        <w:t xml:space="preserve">going concern</w:t>
+      </w:r>
+      <w:r>
+        <w:t xml:space="preserve"> </w:t>
+      </w:r>
+      <w:r>
+        <w:t xml:space="preserve">— an established practice, not a one-off bid. It is designed to:</w:t>
       </w:r>
     </w:p>
     <w:p>
@@ -158,7 +158,7 @@
         <w:t xml:space="preserve"> </w:t>
       </w:r>
       <w:r>
-        <w:t xml:space="preserve">— A bold unique value proposition that speaks directly to organisations like Tiko Africa needing independent, rigorous data quality assurance.</w:t>
+        <w:t xml:space="preserve">— A bold unique value proposition targeting any health programme, NGO, or government partner needing independent data quality assurance in Uganda.</w:t>
       </w:r>
     </w:p>
     <w:p>
@@ -180,7 +180,22 @@
         <w:t xml:space="preserve"> </w:t>
       </w:r>
       <w:r>
-        <w:t xml:space="preserve">— Interactive, media-quality simulated visualisations demonstrating what the RDQA deliverables look like in practice (Verification Factor dashboards, spider charts, facility scorecards, root cause breakdowns).</w:t>
+        <w:t xml:space="preserve">— Interactive, media-quality simulated visualisations demonstrating what RDQA deliverables look like in practice (Verification Factor dashboards, spider charts, facility scorecards, root cause breakdowns). All data is anonymised (</w:t>
+      </w:r>
+      <w:r>
+        <w:t xml:space="preserve">“Facility A1”</w:t>
+      </w:r>
+      <w:r>
+        <w:t xml:space="preserve">,</w:t>
+      </w:r>
+      <w:r>
+        <w:t xml:space="preserve"> </w:t>
+      </w:r>
+      <w:r>
+        <w:t xml:space="preserve">“District A”</w:t>
+      </w:r>
+      <w:r>
+        <w:t xml:space="preserve">) to avoid appearing tailored to any single client.</w:t>
       </w:r>
     </w:p>
     <w:p>
@@ -196,13 +211,47 @@
           <w:b/>
           <w:bCs/>
         </w:rPr>
+        <w:t xml:space="preserve">Showcase Track Record</w:t>
+      </w:r>
+      <w:r>
+        <w:t xml:space="preserve"> </w:t>
+      </w:r>
+      <w:r>
+        <w:t xml:space="preserve">— Past performance section highlighting real engagements (PTBi, MGIC/PEPFAR, iTECH, Sanyu Africa, UVRI) with a</w:t>
+      </w:r>
+      <w:r>
+        <w:t xml:space="preserve"> </w:t>
+      </w:r>
+      <w:r>
+        <w:t xml:space="preserve">“Your Programme Here”</w:t>
+      </w:r>
+      <w:r>
+        <w:t xml:space="preserve"> </w:t>
+      </w:r>
+      <w:r>
+        <w:t xml:space="preserve">invitation to new clients.</w:t>
+      </w:r>
+    </w:p>
+    <w:p>
+      <w:pPr>
+        <w:pStyle w:val="Compact"/>
+        <w:numPr>
+          <w:ilvl w:val="0"/>
+          <w:numId w:val="1001"/>
+        </w:numPr>
+      </w:pPr>
+      <w:r>
+        <w:rPr>
+          <w:b/>
+          <w:bCs/>
+        </w:rPr>
         <w:t xml:space="preserve">Drive Action</w:t>
       </w:r>
       <w:r>
         <w:t xml:space="preserve"> </w:t>
       </w:r>
       <w:r>
-        <w:t xml:space="preserve">— Clear call-to-action for prospective clients to engage the consultancy team.</w:t>
+        <w:t xml:space="preserve">— Clear call-to-action for prospective clients to engage the consultancy team, with a pre-filled email template.</w:t>
       </w:r>
     </w:p>
     <w:p>
@@ -1208,7 +1257,7 @@
         <w:rPr>
           <w:rStyle w:val="VerbatimChar"/>
         </w:rPr>
-        <w:t xml:space="preserve">├── Section 1: Hero / UVP</w:t>
+        <w:t xml:space="preserve">├── Section 1:  Hero / UVP (general consultancy positioning)</w:t>
       </w:r>
       <w:r>
         <w:br/>
@@ -1217,7 +1266,7 @@
         <w:rPr>
           <w:rStyle w:val="VerbatimChar"/>
         </w:rPr>
-        <w:t xml:space="preserve">├── Section 2: The Challenge (Problem Statement)</w:t>
+        <w:t xml:space="preserve">├── Section 2:  Services (RDQA, Digital Cross-Checks, Data Review Sessions)</w:t>
       </w:r>
       <w:r>
         <w:br/>
@@ -1226,7 +1275,7 @@
         <w:rPr>
           <w:rStyle w:val="VerbatimChar"/>
         </w:rPr>
-        <w:t xml:space="preserve">├── Section 3: Our Approach (Three-Way Triangulation)</w:t>
+        <w:t xml:space="preserve">├── Section 3:  The Challenge (Digital vs Paper problem — generic)</w:t>
       </w:r>
       <w:r>
         <w:br/>
@@ -1235,7 +1284,7 @@
         <w:rPr>
           <w:rStyle w:val="VerbatimChar"/>
         </w:rPr>
-        <w:t xml:space="preserve">├── Section 4: Live Demo — Verification Factor Dashboard</w:t>
+        <w:t xml:space="preserve">├── Section 4:  Our Approach (Three Frameworks)</w:t>
       </w:r>
       <w:r>
         <w:br/>
@@ -1244,7 +1293,7 @@
         <w:rPr>
           <w:rStyle w:val="VerbatimChar"/>
         </w:rPr>
-        <w:t xml:space="preserve">├── Section 5: Live Demo — Facility Scorecard Spider Charts</w:t>
+        <w:t xml:space="preserve">├── Section 5:  Live Demo — Verification Factor Dashboard (anonymised facilities)</w:t>
       </w:r>
       <w:r>
         <w:br/>
@@ -1253,7 +1302,7 @@
         <w:rPr>
           <w:rStyle w:val="VerbatimChar"/>
         </w:rPr>
-        <w:t xml:space="preserve">├── Section 6: Live Demo — Root Cause Analysis</w:t>
+        <w:t xml:space="preserve">├── Section 6:  Live Demo — Facility Scorecard Spider Charts</w:t>
       </w:r>
       <w:r>
         <w:br/>
@@ -1262,7 +1311,7 @@
         <w:rPr>
           <w:rStyle w:val="VerbatimChar"/>
         </w:rPr>
-        <w:t xml:space="preserve">├── Section 7: Live Demo — Monthly RDQA Timeline</w:t>
+        <w:t xml:space="preserve">├── Section 7:  Live Demo — Root Cause Analysis</w:t>
       </w:r>
       <w:r>
         <w:br/>
@@ -1271,7 +1320,7 @@
         <w:rPr>
           <w:rStyle w:val="VerbatimChar"/>
         </w:rPr>
-        <w:t xml:space="preserve">├── Section 8: Live Demo — Kampala vs Wakiso Comparison</w:t>
+        <w:t xml:space="preserve">├── Section 8:  Live Demo — Monthly RDQA Timeline</w:t>
       </w:r>
       <w:r>
         <w:br/>
@@ -1280,7 +1329,7 @@
         <w:rPr>
           <w:rStyle w:val="VerbatimChar"/>
         </w:rPr>
-        <w:t xml:space="preserve">├── Section 9: Team Credentials</w:t>
+        <w:t xml:space="preserve">├── Section 9:  Live Demo — Urban vs Peri-Urban Comparison (generic districts)</w:t>
       </w:r>
       <w:r>
         <w:br/>
@@ -1289,7 +1338,7 @@
         <w:rPr>
           <w:rStyle w:val="VerbatimChar"/>
         </w:rPr>
-        <w:t xml:space="preserve">├── Section 10: Frameworks &amp; Methodology</w:t>
+        <w:t xml:space="preserve">├── Section 10: Clients / Past Performance (PTBi, MGIC, iTECH, Sanyu, UVRI + "Your Programme Here")</w:t>
       </w:r>
       <w:r>
         <w:br/>
@@ -1298,7 +1347,7 @@
         <w:rPr>
           <w:rStyle w:val="VerbatimChar"/>
         </w:rPr>
-        <w:t xml:space="preserve">├── Section 11: Deliverables Overview</w:t>
+        <w:t xml:space="preserve">├── Section 11: Team Credentials</w:t>
       </w:r>
       <w:r>
         <w:br/>
@@ -1307,7 +1356,16 @@
         <w:rPr>
           <w:rStyle w:val="VerbatimChar"/>
         </w:rPr>
-        <w:t xml:space="preserve">├── Section 12: Call to Action / Contact</w:t>
+        <w:t xml:space="preserve">├── Section 12: Standard Deliverables</w:t>
+      </w:r>
+      <w:r>
+        <w:br/>
+      </w:r>
+      <w:r>
+        <w:rPr>
+          <w:rStyle w:val="VerbatimChar"/>
+        </w:rPr>
+        <w:t xml:space="preserve">├── Section 13: Call to Action / Contact</w:t>
       </w:r>
       <w:r>
         <w:br/>
@@ -2790,13 +2848,13 @@
           <w:b/>
           <w:bCs/>
         </w:rPr>
-        <w:t xml:space="preserve">12 health facilities</w:t>
-      </w:r>
-      <w:r>
-        <w:t xml:space="preserve"> </w:t>
-      </w:r>
-      <w:r>
-        <w:t xml:space="preserve">across Kampala (6) and Wakiso (6) districts</w:t>
+        <w:t xml:space="preserve">12 anonymised health facilities</w:t>
+      </w:r>
+      <w:r>
+        <w:t xml:space="preserve"> </w:t>
+      </w:r>
+      <w:r>
+        <w:t xml:space="preserve">across District A/Urban (6) and District B/Peri-Urban (6)</w:t>
       </w:r>
     </w:p>
     <w:p>
@@ -3296,13 +3354,47 @@
               <w:pStyle w:val="Compact"/>
             </w:pPr>
             <w:r>
-              <w:t xml:space="preserve">Hero section headline:</w:t>
+              <w:t xml:space="preserve">Hero section:</w:t>
             </w:r>
             <w:r>
               <w:t xml:space="preserve"> </w:t>
             </w:r>
             <w:r>
               <w:t xml:space="preserve">“Data You Can Trust. Decisions You Can Defend.”</w:t>
+            </w:r>
+            <w:r>
+              <w:t xml:space="preserve"> </w:t>
+            </w:r>
+            <w:r>
+              <w:t xml:space="preserve">— positioned as general RDQA consultancy</w:t>
+            </w:r>
+          </w:p>
+        </w:tc>
+      </w:tr>
+      <w:tr>
+        <w:tc>
+          <w:tcPr/>
+          <w:p>
+            <w:pPr>
+              <w:pStyle w:val="Compact"/>
+            </w:pPr>
+            <w:r>
+              <w:rPr>
+                <w:b/>
+                <w:bCs/>
+              </w:rPr>
+              <w:t xml:space="preserve">Services</w:t>
+            </w:r>
+          </w:p>
+        </w:tc>
+        <w:tc>
+          <w:tcPr/>
+          <w:p>
+            <w:pPr>
+              <w:pStyle w:val="Compact"/>
+            </w:pPr>
+            <w:r>
+              <w:t xml:space="preserve">Three service cards: RDQAs, Digital Cross-Checks, Facility Data Review Sessions</w:t>
             </w:r>
           </w:p>
         </w:tc>
@@ -3330,7 +3422,87 @@
               <w:pStyle w:val="Compact"/>
             </w:pPr>
             <w:r>
-              <w:t xml:space="preserve">5 interactive D3.js visualisation sections showing simulated RDQA outputs</w:t>
+              <w:t xml:space="preserve">5 interactive D3.js visualisation sections with anonymised data (Facility A1-A6, B1-B6)</w:t>
+            </w:r>
+          </w:p>
+        </w:tc>
+      </w:tr>
+      <w:tr>
+        <w:tc>
+          <w:tcPr/>
+          <w:p>
+            <w:pPr>
+              <w:pStyle w:val="Compact"/>
+            </w:pPr>
+            <w:r>
+              <w:rPr>
+                <w:b/>
+                <w:bCs/>
+              </w:rPr>
+              <w:t xml:space="preserve">Social Proof / Track Record</w:t>
+            </w:r>
+          </w:p>
+        </w:tc>
+        <w:tc>
+          <w:tcPr/>
+          <w:p>
+            <w:pPr>
+              <w:pStyle w:val="Compact"/>
+            </w:pPr>
+            <w:r>
+              <w:t xml:space="preserve">“Programmes We Have Supported”</w:t>
+            </w:r>
+            <w:r>
+              <w:t xml:space="preserve"> </w:t>
+            </w:r>
+            <w:r>
+              <w:t xml:space="preserve">section — PTBi, MGIC/PEPFAR, iTECH, Sanyu Africa, UVRI</w:t>
+            </w:r>
+          </w:p>
+        </w:tc>
+      </w:tr>
+      <w:tr>
+        <w:tc>
+          <w:tcPr/>
+          <w:p>
+            <w:pPr>
+              <w:pStyle w:val="Compact"/>
+            </w:pPr>
+            <w:r>
+              <w:rPr>
+                <w:b/>
+                <w:bCs/>
+              </w:rPr>
+              <w:t xml:space="preserve">Open for Business</w:t>
+            </w:r>
+          </w:p>
+        </w:tc>
+        <w:tc>
+          <w:tcPr/>
+          <w:p>
+            <w:pPr>
+              <w:pStyle w:val="Compact"/>
+            </w:pPr>
+            <w:r>
+              <w:t xml:space="preserve">“Your Programme Here”</w:t>
+            </w:r>
+            <w:r>
+              <w:t xml:space="preserve"> </w:t>
+            </w:r>
+            <w:r>
+              <w:t xml:space="preserve">card inviting new clients +</w:t>
+            </w:r>
+            <w:r>
+              <w:t xml:space="preserve"> </w:t>
+            </w:r>
+            <w:r>
+              <w:t xml:space="preserve">“Now Accepting Clients”</w:t>
+            </w:r>
+            <w:r>
+              <w:t xml:space="preserve"> </w:t>
+            </w:r>
+            <w:r>
+              <w:t xml:space="preserve">badge</w:t>
             </w:r>
           </w:p>
         </w:tc>
@@ -3358,7 +3530,7 @@
               <w:pStyle w:val="Compact"/>
             </w:pPr>
             <w:r>
-              <w:t xml:space="preserve">Contact section with direct email and</w:t>
+              <w:t xml:space="preserve">Contact section with pre-filled email template and</w:t>
             </w:r>
             <w:r>
               <w:t xml:space="preserve"> </w:t>
@@ -3387,80 +3559,24 @@
                 <w:b/>
                 <w:bCs/>
               </w:rPr>
-              <w:t xml:space="preserve">Urgency/Scarcity</w:t>
-            </w:r>
-          </w:p>
-        </w:tc>
-        <w:tc>
-          <w:tcPr/>
-          <w:p>
-            <w:pPr>
-              <w:pStyle w:val="Compact"/>
-            </w:pPr>
-            <w:r>
-              <w:t xml:space="preserve">“March 2026 Start Date”</w:t>
+              <w:t xml:space="preserve">Availability Signal</w:t>
+            </w:r>
+          </w:p>
+        </w:tc>
+        <w:tc>
+          <w:tcPr/>
+          <w:p>
+            <w:pPr>
+              <w:pStyle w:val="Compact"/>
+            </w:pPr>
+            <w:r>
+              <w:t xml:space="preserve">“Now accepting Q2 2026 engagements across Uganda”</w:t>
             </w:r>
             <w:r>
               <w:t xml:space="preserve"> </w:t>
             </w:r>
             <w:r>
-              <w:t xml:space="preserve">— limited consultancy capacity for Q1</w:t>
-            </w:r>
-          </w:p>
-        </w:tc>
-      </w:tr>
-      <w:tr>
-        <w:tc>
-          <w:tcPr/>
-          <w:p>
-            <w:pPr>
-              <w:pStyle w:val="Compact"/>
-            </w:pPr>
-            <w:r>
-              <w:rPr>
-                <w:b/>
-                <w:bCs/>
-              </w:rPr>
-              <w:t xml:space="preserve">Social Proof</w:t>
-            </w:r>
-          </w:p>
-        </w:tc>
-        <w:tc>
-          <w:tcPr/>
-          <w:p>
-            <w:pPr>
-              <w:pStyle w:val="Compact"/>
-            </w:pPr>
-            <w:r>
-              <w:t xml:space="preserve">Team credentials, 25+ publications, past performance with PTBi, MGIC, UVRI</w:t>
-            </w:r>
-          </w:p>
-        </w:tc>
-      </w:tr>
-      <w:tr>
-        <w:tc>
-          <w:tcPr/>
-          <w:p>
-            <w:pPr>
-              <w:pStyle w:val="Compact"/>
-            </w:pPr>
-            <w:r>
-              <w:rPr>
-                <w:b/>
-                <w:bCs/>
-              </w:rPr>
-              <w:t xml:space="preserve">Three Core Features</w:t>
-            </w:r>
-          </w:p>
-        </w:tc>
-        <w:tc>
-          <w:tcPr/>
-          <w:p>
-            <w:pPr>
-              <w:pStyle w:val="Compact"/>
-            </w:pPr>
-            <w:r>
-              <w:t xml:space="preserve">Three-Way Triangulation, Facility Scorecards, Root Cause Framework</w:t>
+              <w:t xml:space="preserve">badge in hero</w:t>
             </w:r>
           </w:p>
         </w:tc>
@@ -3482,7 +3598,7 @@
           <w:i/>
           <w:iCs/>
         </w:rPr>
-        <w:t xml:space="preserve">Architecture Document — Tiko RDQA Demo Website</w:t>
+        <w:t xml:space="preserve">Architecture Document — Mubiri &amp; Wayesu RDQA Consultancy Website</w:t>
       </w:r>
       <w:r>
         <w:t xml:space="preserve"> </w:t>

</xml_diff>